<commit_message>
test: add stage 3 fixtures, reference checks and version comparison tests
Co-Authored-By: Claude Opus 5.5 <noreply@anthropic.com>
</commit_message>
<xml_diff>
--- a/fixtures/FN-01/bad.docx
+++ b/fixtures/FN-01/bad.docx
@@ -668,6 +668,16 @@
       </w:r>
     </w:p>
     <w:p>
+      <w:r>
+        <w:t xml:space="preserve">Задачи проекта: изучить этапы съёмки, написать сценарий, снять и смонтировать фильм.</w:t>
+      </w:r>
+    </w:p>
+    <w:p>
+      <w:r>
+        <w:t xml:space="preserve">Продукт проекта — короткий фильм о школе.</w:t>
+      </w:r>
+    </w:p>
+    <w:p>
       <w:pPr>
         <w:pStyle w:val="Heading1"/>
         <w:pageBreakBefore/>
@@ -706,27 +716,27 @@
     </w:p>
     <w:p>
       <w:r>
-        <w:t xml:space="preserve">Работа над фильмом начинается с замысла, затем автор пишет сценарий, подбирает актёров и место съёмки, а после съёмки монтирует материал и озвучивает его. Работа над фильмом начинается с замысла, затем автор пишет сценарий, подбирает актёров и место съёмки, а после съёмки монтирует материал и озвучивает его. Работа над фильмом начинается с замысла, затем автор пишет сценарий, подбирает актёров и место съёмки, а после съёмки монтирует материал и озвучивает его.</w:t>
-      </w:r>
-    </w:p>
-    <w:p>
-      <w:r>
-        <w:t xml:space="preserve">Работа над фильмом начинается с замысла, затем автор пишет сценарий, подбирает актёров и место съёмки, а после съёмки монтирует материал и озвучивает его. Работа над фильмом начинается с замысла, затем автор пишет сценарий, подбирает актёров и место съёмки, а после съёмки монтирует материал и озвучивает его. Работа над фильмом начинается с замысла, затем автор пишет сценарий, подбирает актёров и место съёмки, а после съёмки монтирует материал и озвучивает его.</w:t>
-      </w:r>
-    </w:p>
-    <w:p>
-      <w:r>
-        <w:t xml:space="preserve">Работа над фильмом начинается с замысла, затем автор пишет сценарий, подбирает актёров и место съёмки, а после съёмки монтирует материал и озвучивает его. Работа над фильмом начинается с замысла, затем автор пишет сценарий, подбирает актёров и место съёмки, а после съёмки монтирует материал и озвучивает его. Работа над фильмом начинается с замысла, затем автор пишет сценарий, подбирает актёров и место съёмки, а после съёмки монтирует материал и озвучивает его.</w:t>
-      </w:r>
-    </w:p>
-    <w:p>
-      <w:r>
-        <w:t xml:space="preserve">Работа над фильмом начинается с замысла, затем автор пишет сценарий, подбирает актёров и место съёмки, а после съёмки монтирует материал и озвучивает его. Работа над фильмом начинается с замысла, затем автор пишет сценарий, подбирает актёров и место съёмки, а после съёмки монтирует материал и озвучивает его. Работа над фильмом начинается с замысла, затем автор пишет сценарий, подбирает актёров и место съёмки, а после съёмки монтирует материал и озвучивает его.</w:t>
-      </w:r>
-    </w:p>
-    <w:p>
-      <w:r>
-        <w:t xml:space="preserve">Работа над фильмом начинается с замысла, затем автор пишет сценарий, подбирает актёров и место съёмки, а после съёмки монтирует материал и озвучивает его. Работа над фильмом начинается с замысла, затем автор пишет сценарий, подбирает актёров и место съёмки, а после съёмки монтирует материал и озвучивает его. Работа над фильмом начинается с замысла, затем автор пишет сценарий, подбирает актёров и место съёмки, а после съёмки монтирует материал и озвучивает его.</w:t>
+        <w:t xml:space="preserve">Работа над фильмом начинается с замысла, затем автор пишет сценарий, подбирает актёров и место съёмки, а после съёмки монтирует материал и озвучивает его. Работа над фильмом начинается с замысла, затем автор пишет сценарий, подбирает актёров и место съёмки, а после съёмки монтирует материал и озвучивает его. Работа над фильмом начинается с замысла, затем автор пишет сценарий, подбирает актёров и место съёмки, а после съёмки монтирует материал и озвучивает его [1].</w:t>
+      </w:r>
+    </w:p>
+    <w:p>
+      <w:r>
+        <w:t xml:space="preserve">Работа над фильмом начинается с замысла, затем автор пишет сценарий, подбирает актёров и место съёмки, а после съёмки монтирует материал и озвучивает его. Работа над фильмом начинается с замысла, затем автор пишет сценарий, подбирает актёров и место съёмки, а после съёмки монтирует материал и озвучивает его. Работа над фильмом начинается с замысла, затем автор пишет сценарий, подбирает актёров и место съёмки, а после съёмки монтирует материал и озвучивает его [2].</w:t>
+      </w:r>
+    </w:p>
+    <w:p>
+      <w:r>
+        <w:t xml:space="preserve">Работа над фильмом начинается с замысла, затем автор пишет сценарий, подбирает актёров и место съёмки, а после съёмки монтирует материал и озвучивает его. Работа над фильмом начинается с замысла, затем автор пишет сценарий, подбирает актёров и место съёмки, а после съёмки монтирует материал и озвучивает его. Работа над фильмом начинается с замысла, затем автор пишет сценарий, подбирает актёров и место съёмки, а после съёмки монтирует материал и озвучивает его [3].</w:t>
+      </w:r>
+    </w:p>
+    <w:p>
+      <w:r>
+        <w:t xml:space="preserve">Работа над фильмом начинается с замысла, затем автор пишет сценарий, подбирает актёров и место съёмки, а после съёмки монтирует материал и озвучивает его. Работа над фильмом начинается с замысла, затем автор пишет сценарий, подбирает актёров и место съёмки, а после съёмки монтирует материал и озвучивает его. Работа над фильмом начинается с замысла, затем автор пишет сценарий, подбирает актёров и место съёмки, а после съёмки монтирует материал и озвучивает его [4].</w:t>
+      </w:r>
+    </w:p>
+    <w:p>
+      <w:r>
+        <w:t xml:space="preserve">Работа над фильмом начинается с замысла, затем автор пишет сценарий, подбирает актёров и место съёмки, а после съёмки монтирует материал и озвучивает его. Работа над фильмом начинается с замысла, затем автор пишет сценарий, подбирает актёров и место съёмки, а после съёмки монтирует материал и озвучивает его. Работа над фильмом начинается с замысла, затем автор пишет сценарий, подбирает актёров и место съёмки, а после съёмки монтирует материал и озвучивает его [5].</w:t>
       </w:r>
     </w:p>
     <w:p>
@@ -828,6 +838,26 @@
       </w:r>
     </w:p>
     <w:p>
+      <w:r>
+        <w:t xml:space="preserve">Самым сложным оказалось уложиться в срок, потому что съёмки зависели от погоды.</w:t>
+      </w:r>
+    </w:p>
+    <w:p>
+      <w:r>
+        <w:t xml:space="preserve">Сначала я планировал снимать на камеру, но заменил её телефоном, потому что камеры не нашлось.</w:t>
+      </w:r>
+    </w:p>
+    <w:p>
+      <w:r>
+        <w:t xml:space="preserve">Эту трудность я решил так: перенёс уличные сцены в школьный двор.</w:t>
+      </w:r>
+    </w:p>
+    <w:p>
+      <w:r>
+        <w:t xml:space="preserve">В следующий раз я бы заранее составил план съёмок на каждый день.</w:t>
+      </w:r>
+    </w:p>
+    <w:p>
       <w:pPr>
         <w:pStyle w:val="Heading1"/>
         <w:pageBreakBefore/>
@@ -847,7 +877,39 @@
         <w:ind w:firstLine="0"/>
       </w:pPr>
       <w:r>
-        <w:t xml:space="preserve">1. Иванов И. И. Как снять кино. — Москва : Наука, 2020. — 120 с.</w:t>
+        <w:t xml:space="preserve">1. Белов А. А. Монтаж для начинающих. — Москва : Искусство, 2019. — 96 с.</w:t>
+      </w:r>
+    </w:p>
+    <w:p>
+      <w:pPr>
+        <w:ind w:firstLine="0"/>
+      </w:pPr>
+      <w:r>
+        <w:t xml:space="preserve">2. Иванов И. И. Как снять кино. — Москва : Наука, 2020. — 120 с.</w:t>
+      </w:r>
+    </w:p>
+    <w:p>
+      <w:pPr>
+        <w:ind w:firstLine="0"/>
+      </w:pPr>
+      <w:r>
+        <w:t xml:space="preserve">3. Козлова М. В. Сценарий короткого фильма. — Москва : Просвещение, 2021. — 80 с.</w:t>
+      </w:r>
+    </w:p>
+    <w:p>
+      <w:pPr>
+        <w:ind w:firstLine="0"/>
+      </w:pPr>
+      <w:r>
+        <w:t xml:space="preserve">4. Орлов П. С. Свет и звук на съёмке. — Москва : Искусство, 2018. — 110 с.</w:t>
+      </w:r>
+    </w:p>
+    <w:p>
+      <w:pPr>
+        <w:ind w:firstLine="0"/>
+      </w:pPr>
+      <w:r>
+        <w:t xml:space="preserve">5. Школьное кино // Школьный портал. — URL: https://example.org/kino (дата обращения: 20.10.2026).</w:t>
       </w:r>
     </w:p>
     <w:p>

</xml_diff>